<commit_message>
Targeting brief: bilingual creative by Evanov's creative team; drop "Confidential"
All creative is bilingual with French markedly predominant, so the
language split by zone is gone. 3.2 now describes the one set of 3 to 5
photo screens Evanov's creative team builds from our photos, logos,
Facebook video and word bank. The footer no longer says Confidential.

Co-Authored-By: Claude Opus 5.5 <noreply@anthropic.com>
Claude-Session: https://claude.ai/code/session_01FJF8jsxcmxto2zpsBZHp8n
</commit_message>
<xml_diff>
--- a/PEI_Evanov_Display_Targeting_Brief_2026-10-05.docx
+++ b/PEI_Evanov_Display_Targeting_Brief_2026-10-05.docx
@@ -372,7 +372,7 @@
           <w:sz w:val="21"/>
           <w:szCs w:val="21"/>
         </w:rPr>
-        <w:t xml:space="preserve">The main campaign is Generac residential: new installs, service, maintenance and remote monitoring for homeowners. The sub-campaign presents the company itself: its sectors, its qualifications, its history and its Generac division. Planning assumption is roughly 70% of the monthly budget on the main campaign and 30% on the sub-campaign. Please set them up as two campaigns with separate reporting and separate invoice lines. We produce all banners in-house.</w:t>
+        <w:t>The main campaign is Generac residential: new installs, service, maintenance and remote monitoring for homeowners. The sub-campaign presents the company itself: its sectors, its qualifications, its history and its Generac division. Planning assumption is roughly 70% of the monthly budget on the main campaign and 30% on the sub-campaign. Please set them up as two campaigns with separate reporting and separate invoice lines. All creative is bilingual. To start, your creative team builds one set from our photos, logos, video and word bank (3.2 and section 4).</w:t>
       </w:r>
     </w:p>
     <w:p>
@@ -452,7 +452,7 @@
           <w:sz w:val="21"/>
           <w:szCs w:val="21"/>
         </w:rPr>
-        <w:t xml:space="preserve">Positioning on every banner: Poulin Électrique Inc., authorized Generac dealer for residential, Saint-Lazare. New installs · Service · Maintenance · Remote monitoring. Co-branded with the official Generac dealer logo. French is the master; English versions below are for your team's reference.</w:t>
+        <w:t>Positioning on every banner: Poulin Électrique Inc., authorized Generac dealer for residential, Saint-Lazare. New installs · Service · Maintenance · Remote monitoring. Co-branded with the official Generac dealer logo. Creative is bilingual (3.1); the messages below are in English for your team's reference.</w:t>
       </w:r>
     </w:p>
     <w:tbl>
@@ -5927,7 +5927,7 @@
           <w:sz w:val="21"/>
           <w:szCs w:val="21"/>
         </w:rPr>
-        <w:t xml:space="preserve">French creatives click to the Generac page on poulinelectrique.com; English creatives click to en.poulinelectrique.com. Final URLs with UTM parameters come with the creative files.</w:t>
+        <w:t>Bilingual creatives click to the Generac page on poulinelectrique.com (the French site; en.poulinelectrique.com is the English version). We send the final URLs with UTM parameters.</w:t>
       </w:r>
     </w:p>
     <w:p>
@@ -10785,7 +10785,7 @@
           <w:sz w:val="21"/>
           <w:szCs w:val="21"/>
         </w:rPr>
-        <w:t xml:space="preserve">Creatives D, E and G click to the home page (poulinelectrique.com / en.poulinelectrique.com); creative F clicks to the Generac page. URLs with UTM parameters come with the files.</w:t>
+        <w:t>Creatives D, E and G click to the home page (poulinelectrique.com); creative F clicks to the Generac page. We send the final URLs with UTM parameters.</w:t>
       </w:r>
     </w:p>
     <w:p>
@@ -10848,959 +10848,9 @@
           <w:sz w:val="21"/>
           <w:szCs w:val="21"/>
         </w:rPr>
-        <w:t xml:space="preserve">French creative is the master (Charter of the French language / Bill 96). English creative is a separate set with its own URLs. If you can target by browser or page language, serve French to French and English to English. If not, use the split below. French must receive equal or greater delivery in every zone.</w:t>
+        <w:t>All creative is bilingual: French and English on the same banner, shown to everyone in the territory, so no language targeting or split by zone is needed. French must be markedly predominant (Charter of the French language, s. 58, as amended by Bill 96): the French comes first, and the English is smaller and takes less than half the space of the French. The bilingual creatives on our portal follow this layout.</w:t>
       </w:r>
     </w:p>
-    <w:tbl>
-      <w:tblPr>
-        <w:tblW w:type="dxa" w:w="9360"/>
-        <w:tblBorders>
-          <w:top w:val="single" w:color="auto" w:sz="4"/>
-          <w:left w:val="single" w:color="auto" w:sz="4"/>
-          <w:bottom w:val="single" w:color="auto" w:sz="4"/>
-          <w:right w:val="single" w:color="auto" w:sz="4"/>
-          <w:insideH w:val="single" w:color="auto" w:sz="4"/>
-          <w:insideV w:val="single" w:color="auto" w:sz="4"/>
-        </w:tblBorders>
-      </w:tblPr>
-      <w:tblGrid>
-        <w:gridCol w:w="5360"/>
-        <w:gridCol w:w="2000"/>
-        <w:gridCol w:w="2000"/>
-      </w:tblGrid>
-      <w:tr>
-        <w:trPr>
-          <w:cantSplit/>
-          <w:tblHeader/>
-        </w:trPr>
-        <w:tc>
-          <w:tcPr>
-            <w:tcW w:type="dxa" w:w="5360"/>
-            <w:tcBorders>
-              <w:top w:val="single" w:color="D9DEE3" w:sz="4"/>
-              <w:left w:val="single" w:color="D9DEE3" w:sz="4"/>
-              <w:bottom w:val="single" w:color="D9DEE3" w:sz="4"/>
-              <w:right w:val="single" w:color="D9DEE3" w:sz="4"/>
-            </w:tcBorders>
-            <w:shd w:fill="F3F5F7" w:color="auto" w:val="clear"/>
-            <w:tcMar>
-              <w:top w:type="dxa" w:w="70"/>
-              <w:left w:type="dxa" w:w="100"/>
-              <w:bottom w:type="dxa" w:w="70"/>
-              <w:right w:type="dxa" w:w="100"/>
-            </w:tcMar>
-            <w:vAlign w:val="top"/>
-          </w:tcPr>
-          <w:p>
-            <w:pPr>
-              <w:keepNext/>
-              <w:spacing w:after="40"/>
-            </w:pPr>
-            <w:r>
-              <w:rPr>
-                <w:rFonts w:ascii="Calibri" w:cs="Calibri" w:eastAsia="Calibri" w:hAnsi="Calibri"/>
-                <w:b/>
-                <w:bCs/>
-                <w:i w:val="false"/>
-                <w:iCs w:val="false"/>
-                <w:color w:val="5B6770"/>
-                <w:sz w:val="18"/>
-                <w:szCs w:val="18"/>
-              </w:rPr>
-              <w:t xml:space="preserve">Zone</w:t>
-            </w:r>
-          </w:p>
-        </w:tc>
-        <w:tc>
-          <w:tcPr>
-            <w:tcW w:type="dxa" w:w="2000"/>
-            <w:tcBorders>
-              <w:top w:val="single" w:color="D9DEE3" w:sz="4"/>
-              <w:left w:val="single" w:color="D9DEE3" w:sz="4"/>
-              <w:bottom w:val="single" w:color="D9DEE3" w:sz="4"/>
-              <w:right w:val="single" w:color="D9DEE3" w:sz="4"/>
-            </w:tcBorders>
-            <w:shd w:fill="F3F5F7" w:color="auto" w:val="clear"/>
-            <w:tcMar>
-              <w:top w:type="dxa" w:w="70"/>
-              <w:left w:type="dxa" w:w="100"/>
-              <w:bottom w:type="dxa" w:w="70"/>
-              <w:right w:type="dxa" w:w="100"/>
-            </w:tcMar>
-            <w:vAlign w:val="top"/>
-          </w:tcPr>
-          <w:p>
-            <w:pPr>
-              <w:keepNext/>
-              <w:spacing w:after="40"/>
-            </w:pPr>
-            <w:r>
-              <w:rPr>
-                <w:rFonts w:ascii="Calibri" w:cs="Calibri" w:eastAsia="Calibri" w:hAnsi="Calibri"/>
-                <w:b/>
-                <w:bCs/>
-                <w:i w:val="false"/>
-                <w:iCs w:val="false"/>
-                <w:color w:val="5B6770"/>
-                <w:sz w:val="18"/>
-                <w:szCs w:val="18"/>
-              </w:rPr>
-              <w:t xml:space="preserve">French</w:t>
-            </w:r>
-          </w:p>
-        </w:tc>
-        <w:tc>
-          <w:tcPr>
-            <w:tcW w:type="dxa" w:w="2000"/>
-            <w:tcBorders>
-              <w:top w:val="single" w:color="D9DEE3" w:sz="4"/>
-              <w:left w:val="single" w:color="D9DEE3" w:sz="4"/>
-              <w:bottom w:val="single" w:color="D9DEE3" w:sz="4"/>
-              <w:right w:val="single" w:color="D9DEE3" w:sz="4"/>
-            </w:tcBorders>
-            <w:shd w:fill="F3F5F7" w:color="auto" w:val="clear"/>
-            <w:tcMar>
-              <w:top w:type="dxa" w:w="70"/>
-              <w:left w:type="dxa" w:w="100"/>
-              <w:bottom w:type="dxa" w:w="70"/>
-              <w:right w:type="dxa" w:w="100"/>
-            </w:tcMar>
-            <w:vAlign w:val="top"/>
-          </w:tcPr>
-          <w:p>
-            <w:pPr>
-              <w:keepNext/>
-              <w:spacing w:after="40"/>
-            </w:pPr>
-            <w:r>
-              <w:rPr>
-                <w:rFonts w:ascii="Calibri" w:cs="Calibri" w:eastAsia="Calibri" w:hAnsi="Calibri"/>
-                <w:b/>
-                <w:bCs/>
-                <w:i w:val="false"/>
-                <w:iCs w:val="false"/>
-                <w:color w:val="5B6770"/>
-                <w:sz w:val="18"/>
-                <w:szCs w:val="18"/>
-              </w:rPr>
-              <w:t xml:space="preserve">English</w:t>
-            </w:r>
-          </w:p>
-        </w:tc>
-      </w:tr>
-      <w:tr>
-        <w:trPr>
-          <w:cantSplit/>
-        </w:trPr>
-        <w:tc>
-          <w:tcPr>
-            <w:tcW w:type="dxa" w:w="5360"/>
-            <w:tcBorders>
-              <w:top w:val="single" w:color="D9DEE3" w:sz="4"/>
-              <w:left w:val="single" w:color="D9DEE3" w:sz="4"/>
-              <w:bottom w:val="single" w:color="D9DEE3" w:sz="4"/>
-              <w:right w:val="single" w:color="D9DEE3" w:sz="4"/>
-            </w:tcBorders>
-            <w:tcMar>
-              <w:top w:type="dxa" w:w="70"/>
-              <w:left w:type="dxa" w:w="100"/>
-              <w:bottom w:type="dxa" w:w="70"/>
-              <w:right w:type="dxa" w:w="100"/>
-            </w:tcMar>
-            <w:vAlign w:val="top"/>
-          </w:tcPr>
-          <w:p>
-            <w:pPr>
-              <w:keepNext w:val="false"/>
-              <w:spacing w:after="40"/>
-            </w:pPr>
-            <w:r>
-              <w:rPr>
-                <w:rFonts w:ascii="Calibri" w:cs="Calibri" w:eastAsia="Calibri" w:hAnsi="Calibri"/>
-                <w:b w:val="false"/>
-                <w:bCs w:val="false"/>
-                <w:i w:val="false"/>
-                <w:iCs w:val="false"/>
-                <w:color w:val="1A1F24"/>
-                <w:sz w:val="19"/>
-                <w:szCs w:val="19"/>
-              </w:rPr>
-              <w:t xml:space="preserve">Vaudreuil-Soulanges</w:t>
-            </w:r>
-          </w:p>
-        </w:tc>
-        <w:tc>
-          <w:tcPr>
-            <w:tcW w:type="dxa" w:w="2000"/>
-            <w:tcBorders>
-              <w:top w:val="single" w:color="D9DEE3" w:sz="4"/>
-              <w:left w:val="single" w:color="D9DEE3" w:sz="4"/>
-              <w:bottom w:val="single" w:color="D9DEE3" w:sz="4"/>
-              <w:right w:val="single" w:color="D9DEE3" w:sz="4"/>
-            </w:tcBorders>
-            <w:tcMar>
-              <w:top w:type="dxa" w:w="70"/>
-              <w:left w:type="dxa" w:w="100"/>
-              <w:bottom w:type="dxa" w:w="70"/>
-              <w:right w:type="dxa" w:w="100"/>
-            </w:tcMar>
-            <w:vAlign w:val="top"/>
-          </w:tcPr>
-          <w:p>
-            <w:pPr>
-              <w:keepNext w:val="false"/>
-              <w:spacing w:after="40"/>
-            </w:pPr>
-            <w:r>
-              <w:rPr>
-                <w:rFonts w:ascii="Calibri" w:cs="Calibri" w:eastAsia="Calibri" w:hAnsi="Calibri"/>
-                <w:b w:val="false"/>
-                <w:bCs w:val="false"/>
-                <w:i w:val="false"/>
-                <w:iCs w:val="false"/>
-                <w:color w:val="1A1F24"/>
-                <w:sz w:val="19"/>
-                <w:szCs w:val="19"/>
-              </w:rPr>
-              <w:t xml:space="preserve">60%</w:t>
-            </w:r>
-          </w:p>
-        </w:tc>
-        <w:tc>
-          <w:tcPr>
-            <w:tcW w:type="dxa" w:w="2000"/>
-            <w:tcBorders>
-              <w:top w:val="single" w:color="D9DEE3" w:sz="4"/>
-              <w:left w:val="single" w:color="D9DEE3" w:sz="4"/>
-              <w:bottom w:val="single" w:color="D9DEE3" w:sz="4"/>
-              <w:right w:val="single" w:color="D9DEE3" w:sz="4"/>
-            </w:tcBorders>
-            <w:tcMar>
-              <w:top w:type="dxa" w:w="70"/>
-              <w:left w:type="dxa" w:w="100"/>
-              <w:bottom w:type="dxa" w:w="70"/>
-              <w:right w:type="dxa" w:w="100"/>
-            </w:tcMar>
-            <w:vAlign w:val="top"/>
-          </w:tcPr>
-          <w:p>
-            <w:pPr>
-              <w:keepNext w:val="false"/>
-              <w:spacing w:after="40"/>
-            </w:pPr>
-            <w:r>
-              <w:rPr>
-                <w:rFonts w:ascii="Calibri" w:cs="Calibri" w:eastAsia="Calibri" w:hAnsi="Calibri"/>
-                <w:b w:val="false"/>
-                <w:bCs w:val="false"/>
-                <w:i w:val="false"/>
-                <w:iCs w:val="false"/>
-                <w:color w:val="1A1F24"/>
-                <w:sz w:val="19"/>
-                <w:szCs w:val="19"/>
-              </w:rPr>
-              <w:t xml:space="preserve">40%</w:t>
-            </w:r>
-          </w:p>
-        </w:tc>
-      </w:tr>
-      <w:tr>
-        <w:trPr>
-          <w:cantSplit/>
-        </w:trPr>
-        <w:tc>
-          <w:tcPr>
-            <w:tcW w:type="dxa" w:w="5360"/>
-            <w:tcBorders>
-              <w:top w:val="single" w:color="D9DEE3" w:sz="4"/>
-              <w:left w:val="single" w:color="D9DEE3" w:sz="4"/>
-              <w:bottom w:val="single" w:color="D9DEE3" w:sz="4"/>
-              <w:right w:val="single" w:color="D9DEE3" w:sz="4"/>
-            </w:tcBorders>
-            <w:tcMar>
-              <w:top w:type="dxa" w:w="70"/>
-              <w:left w:type="dxa" w:w="100"/>
-              <w:bottom w:type="dxa" w:w="70"/>
-              <w:right w:type="dxa" w:w="100"/>
-            </w:tcMar>
-            <w:vAlign w:val="top"/>
-          </w:tcPr>
-          <w:p>
-            <w:pPr>
-              <w:keepNext w:val="false"/>
-              <w:spacing w:after="40"/>
-            </w:pPr>
-            <w:r>
-              <w:rPr>
-                <w:rFonts w:ascii="Calibri" w:cs="Calibri" w:eastAsia="Calibri" w:hAnsi="Calibri"/>
-                <w:b w:val="false"/>
-                <w:bCs w:val="false"/>
-                <w:i w:val="false"/>
-                <w:iCs w:val="false"/>
-                <w:color w:val="1A1F24"/>
-                <w:sz w:val="19"/>
-                <w:szCs w:val="19"/>
-              </w:rPr>
-              <w:t xml:space="preserve">Deux-Montagnes</w:t>
-            </w:r>
-          </w:p>
-        </w:tc>
-        <w:tc>
-          <w:tcPr>
-            <w:tcW w:type="dxa" w:w="2000"/>
-            <w:tcBorders>
-              <w:top w:val="single" w:color="D9DEE3" w:sz="4"/>
-              <w:left w:val="single" w:color="D9DEE3" w:sz="4"/>
-              <w:bottom w:val="single" w:color="D9DEE3" w:sz="4"/>
-              <w:right w:val="single" w:color="D9DEE3" w:sz="4"/>
-            </w:tcBorders>
-            <w:tcMar>
-              <w:top w:type="dxa" w:w="70"/>
-              <w:left w:type="dxa" w:w="100"/>
-              <w:bottom w:type="dxa" w:w="70"/>
-              <w:right w:type="dxa" w:w="100"/>
-            </w:tcMar>
-            <w:vAlign w:val="top"/>
-          </w:tcPr>
-          <w:p>
-            <w:pPr>
-              <w:keepNext w:val="false"/>
-              <w:spacing w:after="40"/>
-            </w:pPr>
-            <w:r>
-              <w:rPr>
-                <w:rFonts w:ascii="Calibri" w:cs="Calibri" w:eastAsia="Calibri" w:hAnsi="Calibri"/>
-                <w:b w:val="false"/>
-                <w:bCs w:val="false"/>
-                <w:i w:val="false"/>
-                <w:iCs w:val="false"/>
-                <w:color w:val="1A1F24"/>
-                <w:sz w:val="19"/>
-                <w:szCs w:val="19"/>
-              </w:rPr>
-              <w:t xml:space="preserve">90%</w:t>
-            </w:r>
-          </w:p>
-        </w:tc>
-        <w:tc>
-          <w:tcPr>
-            <w:tcW w:type="dxa" w:w="2000"/>
-            <w:tcBorders>
-              <w:top w:val="single" w:color="D9DEE3" w:sz="4"/>
-              <w:left w:val="single" w:color="D9DEE3" w:sz="4"/>
-              <w:bottom w:val="single" w:color="D9DEE3" w:sz="4"/>
-              <w:right w:val="single" w:color="D9DEE3" w:sz="4"/>
-            </w:tcBorders>
-            <w:tcMar>
-              <w:top w:type="dxa" w:w="70"/>
-              <w:left w:type="dxa" w:w="100"/>
-              <w:bottom w:type="dxa" w:w="70"/>
-              <w:right w:type="dxa" w:w="100"/>
-            </w:tcMar>
-            <w:vAlign w:val="top"/>
-          </w:tcPr>
-          <w:p>
-            <w:pPr>
-              <w:keepNext w:val="false"/>
-              <w:spacing w:after="40"/>
-            </w:pPr>
-            <w:r>
-              <w:rPr>
-                <w:rFonts w:ascii="Calibri" w:cs="Calibri" w:eastAsia="Calibri" w:hAnsi="Calibri"/>
-                <w:b w:val="false"/>
-                <w:bCs w:val="false"/>
-                <w:i w:val="false"/>
-                <w:iCs w:val="false"/>
-                <w:color w:val="1A1F24"/>
-                <w:sz w:val="19"/>
-                <w:szCs w:val="19"/>
-              </w:rPr>
-              <w:t xml:space="preserve">10%</w:t>
-            </w:r>
-          </w:p>
-        </w:tc>
-      </w:tr>
-      <w:tr>
-        <w:trPr>
-          <w:cantSplit/>
-        </w:trPr>
-        <w:tc>
-          <w:tcPr>
-            <w:tcW w:type="dxa" w:w="5360"/>
-            <w:tcBorders>
-              <w:top w:val="single" w:color="D9DEE3" w:sz="4"/>
-              <w:left w:val="single" w:color="D9DEE3" w:sz="4"/>
-              <w:bottom w:val="single" w:color="D9DEE3" w:sz="4"/>
-              <w:right w:val="single" w:color="D9DEE3" w:sz="4"/>
-            </w:tcBorders>
-            <w:tcMar>
-              <w:top w:type="dxa" w:w="70"/>
-              <w:left w:type="dxa" w:w="100"/>
-              <w:bottom w:type="dxa" w:w="70"/>
-              <w:right w:type="dxa" w:w="100"/>
-            </w:tcMar>
-            <w:vAlign w:val="top"/>
-          </w:tcPr>
-          <w:p>
-            <w:pPr>
-              <w:keepNext w:val="false"/>
-              <w:spacing w:after="40"/>
-            </w:pPr>
-            <w:r>
-              <w:rPr>
-                <w:rFonts w:ascii="Calibri" w:cs="Calibri" w:eastAsia="Calibri" w:hAnsi="Calibri"/>
-                <w:b w:val="false"/>
-                <w:bCs w:val="false"/>
-                <w:i w:val="false"/>
-                <w:iCs w:val="false"/>
-                <w:color w:val="1A1F24"/>
-                <w:sz w:val="19"/>
-                <w:szCs w:val="19"/>
-              </w:rPr>
-              <w:t xml:space="preserve">Ouest-de-l'Île</w:t>
-            </w:r>
-          </w:p>
-        </w:tc>
-        <w:tc>
-          <w:tcPr>
-            <w:tcW w:type="dxa" w:w="2000"/>
-            <w:tcBorders>
-              <w:top w:val="single" w:color="D9DEE3" w:sz="4"/>
-              <w:left w:val="single" w:color="D9DEE3" w:sz="4"/>
-              <w:bottom w:val="single" w:color="D9DEE3" w:sz="4"/>
-              <w:right w:val="single" w:color="D9DEE3" w:sz="4"/>
-            </w:tcBorders>
-            <w:tcMar>
-              <w:top w:type="dxa" w:w="70"/>
-              <w:left w:type="dxa" w:w="100"/>
-              <w:bottom w:type="dxa" w:w="70"/>
-              <w:right w:type="dxa" w:w="100"/>
-            </w:tcMar>
-            <w:vAlign w:val="top"/>
-          </w:tcPr>
-          <w:p>
-            <w:pPr>
-              <w:keepNext w:val="false"/>
-              <w:spacing w:after="40"/>
-            </w:pPr>
-            <w:r>
-              <w:rPr>
-                <w:rFonts w:ascii="Calibri" w:cs="Calibri" w:eastAsia="Calibri" w:hAnsi="Calibri"/>
-                <w:b w:val="false"/>
-                <w:bCs w:val="false"/>
-                <w:i w:val="false"/>
-                <w:iCs w:val="false"/>
-                <w:color w:val="1A1F24"/>
-                <w:sz w:val="19"/>
-                <w:szCs w:val="19"/>
-              </w:rPr>
-              <w:t xml:space="preserve">50%</w:t>
-            </w:r>
-          </w:p>
-        </w:tc>
-        <w:tc>
-          <w:tcPr>
-            <w:tcW w:type="dxa" w:w="2000"/>
-            <w:tcBorders>
-              <w:top w:val="single" w:color="D9DEE3" w:sz="4"/>
-              <w:left w:val="single" w:color="D9DEE3" w:sz="4"/>
-              <w:bottom w:val="single" w:color="D9DEE3" w:sz="4"/>
-              <w:right w:val="single" w:color="D9DEE3" w:sz="4"/>
-            </w:tcBorders>
-            <w:tcMar>
-              <w:top w:type="dxa" w:w="70"/>
-              <w:left w:type="dxa" w:w="100"/>
-              <w:bottom w:type="dxa" w:w="70"/>
-              <w:right w:type="dxa" w:w="100"/>
-            </w:tcMar>
-            <w:vAlign w:val="top"/>
-          </w:tcPr>
-          <w:p>
-            <w:pPr>
-              <w:keepNext w:val="false"/>
-              <w:spacing w:after="40"/>
-            </w:pPr>
-            <w:r>
-              <w:rPr>
-                <w:rFonts w:ascii="Calibri" w:cs="Calibri" w:eastAsia="Calibri" w:hAnsi="Calibri"/>
-                <w:b w:val="false"/>
-                <w:bCs w:val="false"/>
-                <w:i w:val="false"/>
-                <w:iCs w:val="false"/>
-                <w:color w:val="1A1F24"/>
-                <w:sz w:val="19"/>
-                <w:szCs w:val="19"/>
-              </w:rPr>
-              <w:t xml:space="preserve">50%</w:t>
-            </w:r>
-          </w:p>
-        </w:tc>
-      </w:tr>
-      <w:tr>
-        <w:trPr>
-          <w:cantSplit/>
-        </w:trPr>
-        <w:tc>
-          <w:tcPr>
-            <w:tcW w:type="dxa" w:w="5360"/>
-            <w:tcBorders>
-              <w:top w:val="single" w:color="D9DEE3" w:sz="4"/>
-              <w:left w:val="single" w:color="D9DEE3" w:sz="4"/>
-              <w:bottom w:val="single" w:color="D9DEE3" w:sz="4"/>
-              <w:right w:val="single" w:color="D9DEE3" w:sz="4"/>
-            </w:tcBorders>
-            <w:tcMar>
-              <w:top w:type="dxa" w:w="70"/>
-              <w:left w:type="dxa" w:w="100"/>
-              <w:bottom w:type="dxa" w:w="70"/>
-              <w:right w:type="dxa" w:w="100"/>
-            </w:tcMar>
-            <w:vAlign w:val="top"/>
-          </w:tcPr>
-          <w:p>
-            <w:pPr>
-              <w:keepNext w:val="false"/>
-              <w:spacing w:after="40"/>
-            </w:pPr>
-            <w:r>
-              <w:rPr>
-                <w:rFonts w:ascii="Calibri" w:cs="Calibri" w:eastAsia="Calibri" w:hAnsi="Calibri"/>
-                <w:b w:val="false"/>
-                <w:bCs w:val="false"/>
-                <w:i w:val="false"/>
-                <w:iCs w:val="false"/>
-                <w:color w:val="1A1F24"/>
-                <w:sz w:val="19"/>
-                <w:szCs w:val="19"/>
-              </w:rPr>
-              <w:t xml:space="preserve">Montréal</w:t>
-            </w:r>
-          </w:p>
-        </w:tc>
-        <w:tc>
-          <w:tcPr>
-            <w:tcW w:type="dxa" w:w="2000"/>
-            <w:tcBorders>
-              <w:top w:val="single" w:color="D9DEE3" w:sz="4"/>
-              <w:left w:val="single" w:color="D9DEE3" w:sz="4"/>
-              <w:bottom w:val="single" w:color="D9DEE3" w:sz="4"/>
-              <w:right w:val="single" w:color="D9DEE3" w:sz="4"/>
-            </w:tcBorders>
-            <w:tcMar>
-              <w:top w:type="dxa" w:w="70"/>
-              <w:left w:type="dxa" w:w="100"/>
-              <w:bottom w:type="dxa" w:w="70"/>
-              <w:right w:type="dxa" w:w="100"/>
-            </w:tcMar>
-            <w:vAlign w:val="top"/>
-          </w:tcPr>
-          <w:p>
-            <w:pPr>
-              <w:keepNext w:val="false"/>
-              <w:spacing w:after="40"/>
-            </w:pPr>
-            <w:r>
-              <w:rPr>
-                <w:rFonts w:ascii="Calibri" w:cs="Calibri" w:eastAsia="Calibri" w:hAnsi="Calibri"/>
-                <w:b w:val="false"/>
-                <w:bCs w:val="false"/>
-                <w:i w:val="false"/>
-                <w:iCs w:val="false"/>
-                <w:color w:val="1A1F24"/>
-                <w:sz w:val="19"/>
-                <w:szCs w:val="19"/>
-              </w:rPr>
-              <w:t xml:space="preserve">60%</w:t>
-            </w:r>
-          </w:p>
-        </w:tc>
-        <w:tc>
-          <w:tcPr>
-            <w:tcW w:type="dxa" w:w="2000"/>
-            <w:tcBorders>
-              <w:top w:val="single" w:color="D9DEE3" w:sz="4"/>
-              <w:left w:val="single" w:color="D9DEE3" w:sz="4"/>
-              <w:bottom w:val="single" w:color="D9DEE3" w:sz="4"/>
-              <w:right w:val="single" w:color="D9DEE3" w:sz="4"/>
-            </w:tcBorders>
-            <w:tcMar>
-              <w:top w:type="dxa" w:w="70"/>
-              <w:left w:type="dxa" w:w="100"/>
-              <w:bottom w:type="dxa" w:w="70"/>
-              <w:right w:type="dxa" w:w="100"/>
-            </w:tcMar>
-            <w:vAlign w:val="top"/>
-          </w:tcPr>
-          <w:p>
-            <w:pPr>
-              <w:keepNext w:val="false"/>
-              <w:spacing w:after="40"/>
-            </w:pPr>
-            <w:r>
-              <w:rPr>
-                <w:rFonts w:ascii="Calibri" w:cs="Calibri" w:eastAsia="Calibri" w:hAnsi="Calibri"/>
-                <w:b w:val="false"/>
-                <w:bCs w:val="false"/>
-                <w:i w:val="false"/>
-                <w:iCs w:val="false"/>
-                <w:color w:val="1A1F24"/>
-                <w:sz w:val="19"/>
-                <w:szCs w:val="19"/>
-              </w:rPr>
-              <w:t xml:space="preserve">40%</w:t>
-            </w:r>
-          </w:p>
-        </w:tc>
-      </w:tr>
-      <w:tr>
-        <w:trPr>
-          <w:cantSplit/>
-        </w:trPr>
-        <w:tc>
-          <w:tcPr>
-            <w:tcW w:type="dxa" w:w="5360"/>
-            <w:tcBorders>
-              <w:top w:val="single" w:color="D9DEE3" w:sz="4"/>
-              <w:left w:val="single" w:color="D9DEE3" w:sz="4"/>
-              <w:bottom w:val="single" w:color="D9DEE3" w:sz="4"/>
-              <w:right w:val="single" w:color="D9DEE3" w:sz="4"/>
-            </w:tcBorders>
-            <w:tcMar>
-              <w:top w:type="dxa" w:w="70"/>
-              <w:left w:type="dxa" w:w="100"/>
-              <w:bottom w:type="dxa" w:w="70"/>
-              <w:right w:type="dxa" w:w="100"/>
-            </w:tcMar>
-            <w:vAlign w:val="top"/>
-          </w:tcPr>
-          <w:p>
-            <w:pPr>
-              <w:keepNext w:val="false"/>
-              <w:spacing w:after="40"/>
-            </w:pPr>
-            <w:r>
-              <w:rPr>
-                <w:rFonts w:ascii="Calibri" w:cs="Calibri" w:eastAsia="Calibri" w:hAnsi="Calibri"/>
-                <w:b w:val="false"/>
-                <w:bCs w:val="false"/>
-                <w:i w:val="false"/>
-                <w:iCs w:val="false"/>
-                <w:color w:val="1A1F24"/>
-                <w:sz w:val="19"/>
-                <w:szCs w:val="19"/>
-              </w:rPr>
-              <w:t xml:space="preserve">Rive-Sud</w:t>
-            </w:r>
-          </w:p>
-        </w:tc>
-        <w:tc>
-          <w:tcPr>
-            <w:tcW w:type="dxa" w:w="2000"/>
-            <w:tcBorders>
-              <w:top w:val="single" w:color="D9DEE3" w:sz="4"/>
-              <w:left w:val="single" w:color="D9DEE3" w:sz="4"/>
-              <w:bottom w:val="single" w:color="D9DEE3" w:sz="4"/>
-              <w:right w:val="single" w:color="D9DEE3" w:sz="4"/>
-            </w:tcBorders>
-            <w:tcMar>
-              <w:top w:type="dxa" w:w="70"/>
-              <w:left w:type="dxa" w:w="100"/>
-              <w:bottom w:type="dxa" w:w="70"/>
-              <w:right w:type="dxa" w:w="100"/>
-            </w:tcMar>
-            <w:vAlign w:val="top"/>
-          </w:tcPr>
-          <w:p>
-            <w:pPr>
-              <w:keepNext w:val="false"/>
-              <w:spacing w:after="40"/>
-            </w:pPr>
-            <w:r>
-              <w:rPr>
-                <w:rFonts w:ascii="Calibri" w:cs="Calibri" w:eastAsia="Calibri" w:hAnsi="Calibri"/>
-                <w:b w:val="false"/>
-                <w:bCs w:val="false"/>
-                <w:i w:val="false"/>
-                <w:iCs w:val="false"/>
-                <w:color w:val="1A1F24"/>
-                <w:sz w:val="19"/>
-                <w:szCs w:val="19"/>
-              </w:rPr>
-              <w:t xml:space="preserve">80%</w:t>
-            </w:r>
-          </w:p>
-        </w:tc>
-        <w:tc>
-          <w:tcPr>
-            <w:tcW w:type="dxa" w:w="2000"/>
-            <w:tcBorders>
-              <w:top w:val="single" w:color="D9DEE3" w:sz="4"/>
-              <w:left w:val="single" w:color="D9DEE3" w:sz="4"/>
-              <w:bottom w:val="single" w:color="D9DEE3" w:sz="4"/>
-              <w:right w:val="single" w:color="D9DEE3" w:sz="4"/>
-            </w:tcBorders>
-            <w:tcMar>
-              <w:top w:type="dxa" w:w="70"/>
-              <w:left w:type="dxa" w:w="100"/>
-              <w:bottom w:type="dxa" w:w="70"/>
-              <w:right w:type="dxa" w:w="100"/>
-            </w:tcMar>
-            <w:vAlign w:val="top"/>
-          </w:tcPr>
-          <w:p>
-            <w:pPr>
-              <w:keepNext w:val="false"/>
-              <w:spacing w:after="40"/>
-            </w:pPr>
-            <w:r>
-              <w:rPr>
-                <w:rFonts w:ascii="Calibri" w:cs="Calibri" w:eastAsia="Calibri" w:hAnsi="Calibri"/>
-                <w:b w:val="false"/>
-                <w:bCs w:val="false"/>
-                <w:i w:val="false"/>
-                <w:iCs w:val="false"/>
-                <w:color w:val="1A1F24"/>
-                <w:sz w:val="19"/>
-                <w:szCs w:val="19"/>
-              </w:rPr>
-              <w:t xml:space="preserve">20%</w:t>
-            </w:r>
-          </w:p>
-        </w:tc>
-      </w:tr>
-      <w:tr>
-        <w:trPr>
-          <w:cantSplit/>
-        </w:trPr>
-        <w:tc>
-          <w:tcPr>
-            <w:tcW w:type="dxa" w:w="5360"/>
-            <w:tcBorders>
-              <w:top w:val="single" w:color="D9DEE3" w:sz="4"/>
-              <w:left w:val="single" w:color="D9DEE3" w:sz="4"/>
-              <w:bottom w:val="single" w:color="D9DEE3" w:sz="4"/>
-              <w:right w:val="single" w:color="D9DEE3" w:sz="4"/>
-            </w:tcBorders>
-            <w:tcMar>
-              <w:top w:type="dxa" w:w="70"/>
-              <w:left w:type="dxa" w:w="100"/>
-              <w:bottom w:type="dxa" w:w="70"/>
-              <w:right w:type="dxa" w:w="100"/>
-            </w:tcMar>
-            <w:vAlign w:val="top"/>
-          </w:tcPr>
-          <w:p>
-            <w:pPr>
-              <w:keepNext w:val="false"/>
-              <w:spacing w:after="40"/>
-            </w:pPr>
-            <w:r>
-              <w:rPr>
-                <w:rFonts w:ascii="Calibri" w:cs="Calibri" w:eastAsia="Calibri" w:hAnsi="Calibri"/>
-                <w:b w:val="false"/>
-                <w:bCs w:val="false"/>
-                <w:i w:val="false"/>
-                <w:iCs w:val="false"/>
-                <w:color w:val="1A1F24"/>
-                <w:sz w:val="19"/>
-                <w:szCs w:val="19"/>
-              </w:rPr>
-              <w:t xml:space="preserve">Beauharnois-Salaberry / Haut-Saint-Laurent</w:t>
-            </w:r>
-          </w:p>
-        </w:tc>
-        <w:tc>
-          <w:tcPr>
-            <w:tcW w:type="dxa" w:w="2000"/>
-            <w:tcBorders>
-              <w:top w:val="single" w:color="D9DEE3" w:sz="4"/>
-              <w:left w:val="single" w:color="D9DEE3" w:sz="4"/>
-              <w:bottom w:val="single" w:color="D9DEE3" w:sz="4"/>
-              <w:right w:val="single" w:color="D9DEE3" w:sz="4"/>
-            </w:tcBorders>
-            <w:tcMar>
-              <w:top w:type="dxa" w:w="70"/>
-              <w:left w:type="dxa" w:w="100"/>
-              <w:bottom w:type="dxa" w:w="70"/>
-              <w:right w:type="dxa" w:w="100"/>
-            </w:tcMar>
-            <w:vAlign w:val="top"/>
-          </w:tcPr>
-          <w:p>
-            <w:pPr>
-              <w:keepNext w:val="false"/>
-              <w:spacing w:after="40"/>
-            </w:pPr>
-            <w:r>
-              <w:rPr>
-                <w:rFonts w:ascii="Calibri" w:cs="Calibri" w:eastAsia="Calibri" w:hAnsi="Calibri"/>
-                <w:b w:val="false"/>
-                <w:bCs w:val="false"/>
-                <w:i w:val="false"/>
-                <w:iCs w:val="false"/>
-                <w:color w:val="1A1F24"/>
-                <w:sz w:val="19"/>
-                <w:szCs w:val="19"/>
-              </w:rPr>
-              <w:t xml:space="preserve">90%</w:t>
-            </w:r>
-          </w:p>
-        </w:tc>
-        <w:tc>
-          <w:tcPr>
-            <w:tcW w:type="dxa" w:w="2000"/>
-            <w:tcBorders>
-              <w:top w:val="single" w:color="D9DEE3" w:sz="4"/>
-              <w:left w:val="single" w:color="D9DEE3" w:sz="4"/>
-              <w:bottom w:val="single" w:color="D9DEE3" w:sz="4"/>
-              <w:right w:val="single" w:color="D9DEE3" w:sz="4"/>
-            </w:tcBorders>
-            <w:tcMar>
-              <w:top w:type="dxa" w:w="70"/>
-              <w:left w:type="dxa" w:w="100"/>
-              <w:bottom w:type="dxa" w:w="70"/>
-              <w:right w:type="dxa" w:w="100"/>
-            </w:tcMar>
-            <w:vAlign w:val="top"/>
-          </w:tcPr>
-          <w:p>
-            <w:pPr>
-              <w:keepNext w:val="false"/>
-              <w:spacing w:after="40"/>
-            </w:pPr>
-            <w:r>
-              <w:rPr>
-                <w:rFonts w:ascii="Calibri" w:cs="Calibri" w:eastAsia="Calibri" w:hAnsi="Calibri"/>
-                <w:b w:val="false"/>
-                <w:bCs w:val="false"/>
-                <w:i w:val="false"/>
-                <w:iCs w:val="false"/>
-                <w:color w:val="1A1F24"/>
-                <w:sz w:val="19"/>
-                <w:szCs w:val="19"/>
-              </w:rPr>
-              <w:t xml:space="preserve">10%</w:t>
-            </w:r>
-          </w:p>
-        </w:tc>
-      </w:tr>
-      <w:tr>
-        <w:trPr>
-          <w:cantSplit/>
-        </w:trPr>
-        <w:tc>
-          <w:tcPr>
-            <w:tcW w:type="dxa" w:w="5360"/>
-            <w:tcBorders>
-              <w:top w:val="single" w:color="D9DEE3" w:sz="4"/>
-              <w:left w:val="single" w:color="D9DEE3" w:sz="4"/>
-              <w:bottom w:val="single" w:color="D9DEE3" w:sz="4"/>
-              <w:right w:val="single" w:color="D9DEE3" w:sz="4"/>
-            </w:tcBorders>
-            <w:tcMar>
-              <w:top w:type="dxa" w:w="70"/>
-              <w:left w:type="dxa" w:w="100"/>
-              <w:bottom w:type="dxa" w:w="70"/>
-              <w:right w:type="dxa" w:w="100"/>
-            </w:tcMar>
-            <w:vAlign w:val="top"/>
-          </w:tcPr>
-          <w:p>
-            <w:pPr>
-              <w:keepNext w:val="false"/>
-              <w:spacing w:after="40"/>
-            </w:pPr>
-            <w:r>
-              <w:rPr>
-                <w:rFonts w:ascii="Calibri" w:cs="Calibri" w:eastAsia="Calibri" w:hAnsi="Calibri"/>
-                <w:b w:val="false"/>
-                <w:bCs w:val="false"/>
-                <w:i w:val="false"/>
-                <w:iCs w:val="false"/>
-                <w:color w:val="1A1F24"/>
-                <w:sz w:val="19"/>
-                <w:szCs w:val="19"/>
-              </w:rPr>
-              <w:t xml:space="preserve">Haut-Richelieu</w:t>
-            </w:r>
-          </w:p>
-        </w:tc>
-        <w:tc>
-          <w:tcPr>
-            <w:tcW w:type="dxa" w:w="2000"/>
-            <w:tcBorders>
-              <w:top w:val="single" w:color="D9DEE3" w:sz="4"/>
-              <w:left w:val="single" w:color="D9DEE3" w:sz="4"/>
-              <w:bottom w:val="single" w:color="D9DEE3" w:sz="4"/>
-              <w:right w:val="single" w:color="D9DEE3" w:sz="4"/>
-            </w:tcBorders>
-            <w:tcMar>
-              <w:top w:type="dxa" w:w="70"/>
-              <w:left w:type="dxa" w:w="100"/>
-              <w:bottom w:type="dxa" w:w="70"/>
-              <w:right w:type="dxa" w:w="100"/>
-            </w:tcMar>
-            <w:vAlign w:val="top"/>
-          </w:tcPr>
-          <w:p>
-            <w:pPr>
-              <w:keepNext w:val="false"/>
-              <w:spacing w:after="40"/>
-            </w:pPr>
-            <w:r>
-              <w:rPr>
-                <w:rFonts w:ascii="Calibri" w:cs="Calibri" w:eastAsia="Calibri" w:hAnsi="Calibri"/>
-                <w:b w:val="false"/>
-                <w:bCs w:val="false"/>
-                <w:i w:val="false"/>
-                <w:iCs w:val="false"/>
-                <w:color w:val="1A1F24"/>
-                <w:sz w:val="19"/>
-                <w:szCs w:val="19"/>
-              </w:rPr>
-              <w:t xml:space="preserve">90%</w:t>
-            </w:r>
-          </w:p>
-        </w:tc>
-        <w:tc>
-          <w:tcPr>
-            <w:tcW w:type="dxa" w:w="2000"/>
-            <w:tcBorders>
-              <w:top w:val="single" w:color="D9DEE3" w:sz="4"/>
-              <w:left w:val="single" w:color="D9DEE3" w:sz="4"/>
-              <w:bottom w:val="single" w:color="D9DEE3" w:sz="4"/>
-              <w:right w:val="single" w:color="D9DEE3" w:sz="4"/>
-            </w:tcBorders>
-            <w:tcMar>
-              <w:top w:type="dxa" w:w="70"/>
-              <w:left w:type="dxa" w:w="100"/>
-              <w:bottom w:type="dxa" w:w="70"/>
-              <w:right w:type="dxa" w:w="100"/>
-            </w:tcMar>
-            <w:vAlign w:val="top"/>
-          </w:tcPr>
-          <w:p>
-            <w:pPr>
-              <w:keepNext w:val="false"/>
-              <w:spacing w:after="40"/>
-            </w:pPr>
-            <w:r>
-              <w:rPr>
-                <w:rFonts w:ascii="Calibri" w:cs="Calibri" w:eastAsia="Calibri" w:hAnsi="Calibri"/>
-                <w:b w:val="false"/>
-                <w:bCs w:val="false"/>
-                <w:i w:val="false"/>
-                <w:iCs w:val="false"/>
-                <w:color w:val="1A1F24"/>
-                <w:sz w:val="19"/>
-                <w:szCs w:val="19"/>
-              </w:rPr>
-              <w:t xml:space="preserve">10%</w:t>
-            </w:r>
-          </w:p>
-        </w:tc>
-      </w:tr>
-    </w:tbl>
     <w:p>
       <w:pPr>
         <w:pStyle w:val="Heading2"/>
@@ -11808,7 +10858,159 @@
         <w:spacing w:after="100" w:before="260"/>
       </w:pPr>
       <w:r>
-        <w:t xml:space="preserve">3.2  Creative we will deliver</w:t>
+        <w:t>3.2  Creative</w:t>
+      </w:r>
+    </w:p>
+    <w:p>
+      <w:pPr>
+        <w:keepNext w:val="false"/>
+        <w:spacing w:after="120" w:before="0"/>
+        <w:jc w:val="left"/>
+      </w:pPr>
+      <w:r>
+        <w:rPr>
+          <w:rFonts w:ascii="Calibri" w:cs="Calibri" w:eastAsia="Calibri" w:hAnsi="Calibri"/>
+          <w:b w:val="false"/>
+          <w:bCs w:val="false"/>
+          <w:i w:val="false"/>
+          <w:iCs w:val="false"/>
+          <w:color w:val="1A1F24"/>
+          <w:sz w:val="21"/>
+          <w:szCs w:val="21"/>
+        </w:rPr>
+        <w:t>To start: one bilingual set of creatives, built by your creative team from our material. Each creative has 3 to 5 photo screens, and the first one can include our Facebook video. The screens:</w:t>
+      </w:r>
+    </w:p>
+    <w:p>
+      <w:pPr>
+        <w:pStyle w:val="ListParagraph"/>
+        <w:numPr>
+          <w:ilvl w:val="0"/>
+          <w:numId w:val="2"/>
+        </w:numPr>
+        <w:spacing w:after="60"/>
+      </w:pPr>
+      <w:r>
+        <w:rPr>
+          <w:rFonts w:ascii="Calibri" w:cs="Calibri" w:eastAsia="Calibri" w:hAnsi="Calibri"/>
+          <w:b w:val="false"/>
+          <w:bCs w:val="false"/>
+          <w:i w:val="false"/>
+          <w:iCs w:val="false"/>
+          <w:color w:val="1A1F24"/>
+          <w:sz w:val="21"/>
+          <w:szCs w:val="21"/>
+        </w:rPr>
+        <w:t>Work Done Right: one photo focused on our electrician services.</w:t>
+      </w:r>
+    </w:p>
+    <w:p>
+      <w:pPr>
+        <w:pStyle w:val="ListParagraph"/>
+        <w:numPr>
+          <w:ilvl w:val="0"/>
+          <w:numId w:val="2"/>
+        </w:numPr>
+        <w:spacing w:after="60"/>
+      </w:pPr>
+      <w:r>
+        <w:rPr>
+          <w:rFonts w:ascii="Calibri" w:cs="Calibri" w:eastAsia="Calibri" w:hAnsi="Calibri"/>
+          <w:b w:val="false"/>
+          <w:bCs w:val="false"/>
+          <w:i w:val="false"/>
+          <w:iCs w:val="false"/>
+          <w:color w:val="1A1F24"/>
+          <w:sz w:val="21"/>
+          <w:szCs w:val="21"/>
+        </w:rPr>
+        <w:t>Work Done Right with the Generac logo.</w:t>
+      </w:r>
+    </w:p>
+    <w:p>
+      <w:pPr>
+        <w:pStyle w:val="ListParagraph"/>
+        <w:numPr>
+          <w:ilvl w:val="0"/>
+          <w:numId w:val="2"/>
+        </w:numPr>
+        <w:spacing w:after="60"/>
+      </w:pPr>
+      <w:r>
+        <w:rPr>
+          <w:rFonts w:ascii="Calibri" w:cs="Calibri" w:eastAsia="Calibri" w:hAnsi="Calibri"/>
+          <w:b w:val="false"/>
+          <w:bCs w:val="false"/>
+          <w:i w:val="false"/>
+          <w:iCs w:val="false"/>
+          <w:color w:val="1A1F24"/>
+          <w:sz w:val="21"/>
+          <w:szCs w:val="21"/>
+        </w:rPr>
+        <w:t>Authorized Generac dealer, with 24/7 remote monitoring (Mobile Link) through Poulin.</w:t>
+      </w:r>
+    </w:p>
+    <w:p>
+      <w:pPr>
+        <w:pStyle w:val="ListParagraph"/>
+        <w:numPr>
+          <w:ilvl w:val="0"/>
+          <w:numId w:val="2"/>
+        </w:numPr>
+        <w:spacing w:after="60"/>
+      </w:pPr>
+      <w:r>
+        <w:rPr>
+          <w:rFonts w:ascii="Calibri" w:cs="Calibri" w:eastAsia="Calibri" w:hAnsi="Calibri"/>
+          <w:b w:val="false"/>
+          <w:bCs w:val="false"/>
+          <w:i w:val="false"/>
+          <w:iCs w:val="false"/>
+          <w:color w:val="1A1F24"/>
+          <w:sz w:val="21"/>
+          <w:szCs w:val="21"/>
+        </w:rPr>
+        <w:t>Our favourite photos for the remaining screens: we send our selection.</w:t>
+      </w:r>
+    </w:p>
+    <w:p>
+      <w:pPr>
+        <w:keepNext w:val="false"/>
+        <w:spacing w:after="120" w:before="120"/>
+        <w:jc w:val="left"/>
+      </w:pPr>
+      <w:r>
+        <w:rPr>
+          <w:rFonts w:ascii="Calibri" w:cs="Calibri" w:eastAsia="Calibri" w:hAnsi="Calibri"/>
+          <w:b w:val="false"/>
+          <w:bCs w:val="false"/>
+          <w:i w:val="false"/>
+          <w:iCs w:val="false"/>
+          <w:color w:val="1A1F24"/>
+          <w:sz w:val="21"/>
+          <w:szCs w:val="21"/>
+        </w:rPr>
+        <w:t>We supply the photos (the English, French and bilingual versions already sent, plus our favourites), our logo and the Generac dealer logo, the Facebook video (Generac maintenance and service, 1920 × 1080, 18.7 s, with sound, no subtitles) and the word bank in section 4. Everything is on the portal, evanov.poulinelectrique.com, where your team can download it.</w:t>
+      </w:r>
+    </w:p>
+    <w:p>
+      <w:pPr>
+        <w:keepNext/>
+        <w:spacing w:after="80" w:before="0"/>
+        <w:jc w:val="left"/>
+      </w:pPr>
+      <w:r>
+        <w:rPr>
+          <w:rFonts w:ascii="Calibri" w:cs="Calibri" w:eastAsia="Calibri" w:hAnsi="Calibri"/>
+          <w:b w:val="false"/>
+          <w:bCs w:val="false"/>
+          <w:i w:val="false"/>
+          <w:iCs w:val="false"/>
+          <w:color w:val="5B6770"/>
+          <w:sz w:val="18"/>
+          <w:szCs w:val="18"/>
+        </w:rPr>
+        <w:t xml:space="preserve">Sizes we expect; your team confirms what the inventory needs.</w:t>
       </w:r>
     </w:p>
     <w:tbl>
@@ -12022,7 +11224,7 @@
                 <w:sz w:val="19"/>
                 <w:szCs w:val="19"/>
               </w:rPr>
-              <w:t xml:space="preserve">Static PNG + animated GIF</w:t>
+              <w:t>Animated + static backup</w:t>
             </w:r>
           </w:p>
         </w:tc>
@@ -12059,7 +11261,7 @@
                 <w:sz w:val="19"/>
                 <w:szCs w:val="19"/>
               </w:rPr>
-              <w:t xml:space="preserve">Required. Three frames, ends on the call to action.</w:t>
+              <w:t>Required. 3 to 5 screens, ends on the call to action.</w:t>
             </w:r>
           </w:p>
         </w:tc>
@@ -12138,7 +11340,7 @@
                 <w:sz w:val="19"/>
                 <w:szCs w:val="19"/>
               </w:rPr>
-              <w:t xml:space="preserve">Static PNG + animated GIF</w:t>
+              <w:t>Animated + static backup</w:t>
             </w:r>
           </w:p>
         </w:tc>
@@ -12254,7 +11456,7 @@
                 <w:sz w:val="19"/>
                 <w:szCs w:val="19"/>
               </w:rPr>
-              <w:t xml:space="preserve">Static PNG + animated GIF</w:t>
+              <w:t>Animated + static backup</w:t>
             </w:r>
           </w:p>
         </w:tc>
@@ -12450,7 +11652,7 @@
           <w:sz w:val="21"/>
           <w:szCs w:val="21"/>
         </w:rPr>
-        <w:t xml:space="preserve">All banners are produced in-house by Poulin Électrique; no Evanov creative services are needed. Every size in French and English, per campaign. File names follow PEI_GEN_FR_300x250_A_v1.png (main campaign) and PEI_BRAND_EN_728x90_D_v1.gif (sub-campaign) so reporting by creative stays readable.</w:t>
+        <w:t>Please send us a proof of each creative before launch so we can approve the French, the layout and the logos.</w:t>
       </w:r>
     </w:p>
     <w:p>
@@ -12470,7 +11672,7 @@
           <w:sz w:val="21"/>
           <w:szCs w:val="21"/>
         </w:rPr>
-        <w:t xml:space="preserve">Please confirm before we export: </w:t>
+        <w:t xml:space="preserve">Please confirm: </w:t>
       </w:r>
       <w:r>
         <w:rPr>
@@ -12483,7 +11685,7 @@
           <w:sz w:val="21"/>
           <w:szCs w:val="21"/>
         </w:rPr>
-        <w:t xml:space="preserve">maximum file weight per size, maximum animation length and loop count, whether HTML5 is accepted or GIF preferred, how the click-tracking macro is handled, and the creative deadline ahead of launch.</w:t>
+        <w:t>maximum file weight per size, maximum animation length and loop count, whether HTML5 or video is accepted, how the click-tracking macro is handled, and the launch date.</w:t>
       </w:r>
     </w:p>
     <w:p>
@@ -12599,7 +11801,7 @@
           <w:sz w:val="21"/>
           <w:szCs w:val="21"/>
         </w:rPr>
-        <w:t xml:space="preserve">Spec confirmation and creative deadline (3.2).</w:t>
+        <w:t>Spec confirmation, launch date and a proof of each creative before launch (3.2).</w:t>
       </w:r>
     </w:p>
     <w:p>
@@ -12646,29 +11848,6 @@
           <w:szCs w:val="21"/>
         </w:rPr>
         <w:t xml:space="preserve">Written proposal with the two campaigns as separate lines (3.3).</w:t>
-      </w:r>
-    </w:p>
-    <w:p>
-      <w:pPr>
-        <w:pStyle w:val="ListParagraph"/>
-        <w:numPr>
-          <w:ilvl w:val="0"/>
-          <w:numId w:val="3"/>
-        </w:numPr>
-        <w:spacing w:after="60"/>
-      </w:pPr>
-      <w:r>
-        <w:rPr>
-          <w:rFonts w:ascii="Calibri" w:cs="Calibri" w:eastAsia="Calibri" w:hAnsi="Calibri"/>
-          <w:b w:val="false"/>
-          <w:bCs w:val="false"/>
-          <w:i w:val="false"/>
-          <w:iCs w:val="false"/>
-          <w:color w:val="1A1F24"/>
-          <w:sz w:val="21"/>
-          <w:szCs w:val="21"/>
-        </w:rPr>
-        <w:t xml:space="preserve">Confirmation that language targeting is possible, or acceptance of the split in 3.1.</w:t>
       </w:r>
     </w:p>
     <w:p>
@@ -14671,7 +13850,7 @@
           <w:sz w:val="18"/>
           <w:szCs w:val="18"/>
         </w:rPr>
-        <w:t xml:space="preserve">Short enough for a 300 × 250 frame. For bilingual creative, pair the English and French of the same line.</w:t>
+        <w:t>Short enough for a 300 × 250 screen. Pair the French and English of the same line, French first and larger (3.1).</w:t>
       </w:r>
     </w:p>
     <w:tbl>
@@ -16774,7 +15953,7 @@
         <w:sz w:val="16"/>
         <w:szCs w:val="16"/>
       </w:rPr>
-      <w:t xml:space="preserve">Confidential · Poulin Électrique Inc. · Prepared for Evanov Communications  ·  Page </w:t>
+      <w:t xml:space="preserve">Poulin Électrique Inc. · Prepared for Evanov Communications  ·  Page </w:t>
     </w:r>
     <w:r>
       <w:rPr>

</xml_diff>

<commit_message>
Show the Facebook video once; brief says remote monitoring, not 24/7
Final uploads no longer lists files named in Final-Uploads/hide.txt.
The uploaded Facebook video is listed there because the Facebook ads
section already shows it, without subtitles. The Nextcloud file stays.

Brief: "remote monitoring" everywhere instead of "24/7 remote
monitoring", and a note that we do not offer 24/7 monitoring.

Co-Authored-By: Claude Opus 5.5 <noreply@anthropic.com>
Claude-Session: https://claude.ai/code/session_01FJF8jsxcmxto2zpsBZHp8n
</commit_message>
<xml_diff>
--- a/PEI_Evanov_Display_Targeting_Brief_2026-10-05.docx
+++ b/PEI_Evanov_Display_Targeting_Brief_2026-10-05.docx
@@ -10947,7 +10947,7 @@
           <w:sz w:val="21"/>
           <w:szCs w:val="21"/>
         </w:rPr>
-        <w:t>Authorized Generac dealer, with 24/7 remote monitoring (Mobile Link) through Poulin.</w:t>
+        <w:t>Authorized Generac dealer, with remote monitoring (Mobile Link) through Poulin.</w:t>
       </w:r>
     </w:p>
     <w:p>
@@ -12472,7 +12472,7 @@
                 <w:sz w:val="19"/>
                 <w:szCs w:val="19"/>
               </w:rPr>
-              <w:t xml:space="preserve">home standby generator  ·  whole-home backup power  ·  permanent, installed outside  ·  starts automatically  ·  power back in seconds  ·  automatic transfer switch  ·  runs on natural gas or propane  ·  no gas cans, no refuelling  ·  quiet weekly self-test  ·  keeps the heat, well, sump pump, fridge and internet running  ·  sized for your home  ·  24/7 remote monitoring with Mobile Link  ·  alerts on your phone  ·  Generac</w:t>
+              <w:t xml:space="preserve">home standby generator  ·  whole-home backup power  ·  permanent, installed outside  ·  starts automatically  ·  power back in seconds  ·  automatic transfer switch  ·  runs on natural gas or propane  ·  no gas cans, no refuelling  ·  quiet weekly self-test  ·  keeps the heat, well, sump pump, fridge and internet running  ·  sized for your home  ·  remote monitoring with Mobile Link  ·  alerts on your phone  ·  Generac</w:t>
             </w:r>
           </w:p>
         </w:tc>
@@ -12509,7 +12509,7 @@
                 <w:sz w:val="19"/>
                 <w:szCs w:val="19"/>
               </w:rPr>
-              <w:t xml:space="preserve">génératrice résidentielle  ·  génératrice de secours  ·  courant de secours pour toute la maison  ·  permanente, installée à l’extérieur  ·  démarre toute seule  ·  le courant revient en quelques secondes  ·  commutateur de transfert automatique  ·  fonctionne au gaz naturel ou au propane  ·  pas de bidons d’essence, rien à remplir  ·  autotest silencieux chaque semaine  ·  garde le chauffage, le puits, la pompe de puisard, le frigo et Internet en marche  ·  choisie selon la taille de votre maison  ·  surveillance à distance 24/7 avec Mobile Link  ·  alertes sur votre téléphone  ·  Generac</w:t>
+              <w:t xml:space="preserve">génératrice résidentielle  ·  génératrice de secours  ·  courant de secours pour toute la maison  ·  permanente, installée à l’extérieur  ·  démarre toute seule  ·  le courant revient en quelques secondes  ·  commutateur de transfert automatique  ·  fonctionne au gaz naturel ou au propane  ·  pas de bidons d’essence, rien à remplir  ·  autotest silencieux chaque semaine  ·  garde le chauffage, le puits, la pompe de puisard, le frigo et Internet en marche  ·  choisie selon la taille de votre maison  ·  surveillance à distance avec Mobile Link  ·  alertes sur votre téléphone  ·  Generac</w:t>
             </w:r>
           </w:p>
         </w:tc>
@@ -15108,7 +15108,7 @@
                 <w:sz w:val="19"/>
                 <w:szCs w:val="19"/>
               </w:rPr>
-              <w:t xml:space="preserve">Authorized Generac dealer  ·  24/7 remote monitoring</w:t>
+              <w:t xml:space="preserve">Authorized Generac dealer  ·  Remote monitoring</w:t>
             </w:r>
           </w:p>
         </w:tc>
@@ -15145,7 +15145,7 @@
                 <w:sz w:val="19"/>
                 <w:szCs w:val="19"/>
               </w:rPr>
-              <w:t xml:space="preserve">Concessionnaire Generac autorisé  ·  Surveillance à distance 24/7</w:t>
+              <w:t xml:space="preserve">Concessionnaire Generac autorisé  ·  Surveillance à distance</w:t>
             </w:r>
           </w:p>
         </w:tc>
@@ -15884,7 +15884,7 @@
           <w:sz w:val="21"/>
           <w:szCs w:val="21"/>
         </w:rPr>
-        <w:t xml:space="preserve">Use the facts as written above. No prices, promotions, financing or 24/7 emergency service unless Maggie confirms it. The 24/7 in our message is Mobile Link remote monitoring; our phones are answered Mon–Thu 7:00–15:00 and Fri 7:00–12:00.</w:t>
+        <w:t xml:space="preserve">Use the facts as written above. No prices, promotions, financing or “24/7” unless Maggie confirms it. We offer remote monitoring (Mobile Link), not 24/7 monitoring, and our phones are answered Mon–Thu 7:00–15:00 and Fri 7:00–12:00.</w:t>
       </w:r>
     </w:p>
     <w:sectPr>

</xml_diff>